<commit_message>
docs: descope TC workflow and student promotion engine from plan
Client decision: TC/Transfer Certificate workflow and academic-year
student promotion/rollover are not the platform's purpose. Removed
from Student Registry Critical tier; dependent items (Transfer/TC log
report, Alumni-linkage) reduced to a gate/hide action or descoped
outright. Student Registry remaining effort revised from ~33-43 pd
to ~17-21 pd.
</commit_message>
<xml_diff>
--- a/docs/GAP_ANALYSIS/Multi-Web_Completion_Plan_Status.docx
+++ b/docs/GAP_ANALYSIS/Multi-Web_Completion_Plan_Status.docx
@@ -332,7 +332,7 @@
                 <w:b w:val="false"/>
                 <w:bCs w:val="false"/>
               </w:rPr>
-              <w:t xml:space="preserve">~33-43 pd</w:t>
+              <w:t xml:space="preserve">~17-21 pd</w:t>
             </w:r>
           </w:p>
         </w:tc>
@@ -349,7 +349,7 @@
                 <w:b w:val="false"/>
                 <w:bCs w:val="false"/>
               </w:rPr>
-              <w:t xml:space="preserve">TC workflow, promotion engine, and reject-with-remarks are the big-ticket items.</w:t>
+              <w:t xml:space="preserve">TC workflow and class-promotion engine descoped (not platform purpose). Reject-with-remarks + notifications are now the biggest items.</w:t>
             </w:r>
           </w:p>
         </w:tc>
@@ -581,7 +581,20 @@
         <w:spacing w:after="120"/>
       </w:pPr>
       <w:r>
-        <w:t xml:space="preserve">Total remaining effort across the four not-fully-done modules: roughly 237-274 person-days. Sections below give the full checklist for each, carried over from the completion-plan re-audit (docs/GAP_ANALYSIS/COMPLETION_PLAN_Sports_Training_TalentSearch_Student_Teacher.docx), corrected against a direct re-check of the current codebase — the on-disk plan document's Talent Search section was stale (it still described 4 Critical items as unfixed that were in fact already implemented and committed in this engagement), so that section was verified fresh rather than copied as-is.</w:t>
+        <w:t xml:space="preserve">Total remaining effort across the four not-fully-done modules: roughly 221-258 person-days. Sections below give the full checklist for each, carried over from the completion-plan re-audit (docs/GAP_ANALYSIS/COMPLETION_PLAN_Sports_Training_TalentSearch_Student_Teacher.docx), corrected against a direct re-check of the current codebase — the on-disk plan document's Talent Search section was stale (it still described 4 Critical items as unfixed that were in fact already implemented and committed in this engagement), so that section was verified fresh rather than copied as-is.</w:t>
+      </w:r>
+    </w:p>
+    <w:p>
+      <w:pPr>
+        <w:spacing w:after="120"/>
+      </w:pPr>
+      <w:r>
+        <w:rPr>
+          <w:b/>
+          <w:bCs/>
+          <w:color w:val="b91c1c"/>
+        </w:rPr>
+        <w:t xml:space="preserve">Scope note: the TC/Transfer Certificate workflow and the academic-year student promotion/rollover engine were explicitly descoped by the client ("not our purpose") and are struck through below rather than estimated. Everything in Student Registry that depended on either has been reduced or removed accordingly.</w:t>
       </w:r>
     </w:p>
     <w:p>
@@ -632,7 +645,7 @@
         <w:spacing w:after="120"/>
       </w:pPr>
       <w:r>
-        <w:t xml:space="preserve">Baseline coverage 64%. Recent commits (2026-07-09/10) added fest class-group/cluster eligibility logic and a school-side import-history viewer — both genuine but neither closes a Student Registry gap. None of the items below have been started.</w:t>
+        <w:t xml:space="preserve">Baseline coverage 64%. Recent commits (2026-07-09/10) added fest class-group/cluster eligibility logic and a school-side import-history viewer — both genuine but neither closes a Student Registry gap. TC/Transfer Certificate workflow and academic-year class-promotion/rollover are explicitly out of scope (client decision — "not our purpose"); everything below reflects that. None of the remaining items have been started.</w:t>
       </w:r>
     </w:p>
     <w:p>
@@ -641,63 +654,73 @@
         <w:spacing w:after="120" w:before="240"/>
       </w:pPr>
       <w:r>
-        <w:t xml:space="preserve">Critical (~19-25 pd)</w:t>
-      </w:r>
-    </w:p>
-    <w:p>
-      <w:pPr>
-        <w:pStyle w:val="ListParagraph"/>
-        <w:numPr>
-          <w:ilvl w:val="0"/>
-          <w:numId w:val="2"/>
-        </w:numPr>
-        <w:spacing w:after="90"/>
-      </w:pPr>
-      <w:r>
-        <w:rPr>
-          <w:b/>
-          <w:bCs/>
-        </w:rPr>
-        <w:t xml:space="preserve">☐  </w:t>
-      </w:r>
-      <w:r>
-        <w:t xml:space="preserve">Build TC/Transfer Certificate workflow end-to-end: student_id FK on tc_requests, School + Sahodaya controllers, request/review/issue Vue pages.</w:t>
-      </w:r>
-      <w:r>
-        <w:rPr>
-          <w:i/>
-          <w:iCs/>
-          <w:color w:val="6b7280"/>
-        </w:rPr>
-        <w:t xml:space="preserve">  — effort: 6-8d</w:t>
-      </w:r>
-    </w:p>
-    <w:p>
-      <w:pPr>
-        <w:pStyle w:val="ListParagraph"/>
-        <w:numPr>
-          <w:ilvl w:val="0"/>
-          <w:numId w:val="2"/>
-        </w:numPr>
-        <w:spacing w:after="90"/>
-      </w:pPr>
-      <w:r>
-        <w:rPr>
-          <w:b/>
-          <w:bCs/>
-        </w:rPr>
-        <w:t xml:space="preserve">☐  </w:t>
-      </w:r>
-      <w:r>
-        <w:t xml:space="preserve">Build academic-year promotion/rollover engine: bulk-advance school_class_id, mark graduated/transferred/withdrawn, preview-before-commit UI.</w:t>
-      </w:r>
-      <w:r>
-        <w:rPr>
-          <w:i/>
-          <w:iCs/>
-          <w:color w:val="6b7280"/>
-        </w:rPr>
-        <w:t xml:space="preserve">  — effort: 8-10d</w:t>
+        <w:t xml:space="preserve">Critical (~5-7 pd)</w:t>
+      </w:r>
+    </w:p>
+    <w:p>
+      <w:pPr>
+        <w:pStyle w:val="ListParagraph"/>
+        <w:numPr>
+          <w:ilvl w:val="0"/>
+          <w:numId w:val="2"/>
+        </w:numPr>
+        <w:spacing w:after="90"/>
+      </w:pPr>
+      <w:r>
+        <w:rPr>
+          <w:b/>
+          <w:bCs/>
+          <w:color w:val="b91c1c"/>
+        </w:rPr>
+        <w:t xml:space="preserve">⊘  </w:t>
+      </w:r>
+      <w:r>
+        <w:rPr>
+          <w:strike/>
+          <w:color w:val="6b7280"/>
+        </w:rPr>
+        <w:t xml:space="preserve">Build TC/Transfer Certificate workflow end-to-end (student_id FK on tc_requests, School + Sahodaya controllers, request/review/issue Vue pages)</w:t>
+      </w:r>
+      <w:r>
+        <w:rPr>
+          <w:i/>
+          <w:iCs/>
+          <w:color w:val="b91c1c"/>
+        </w:rPr>
+        <w:t xml:space="preserve">  — descoped, not our purpose</w:t>
+      </w:r>
+    </w:p>
+    <w:p>
+      <w:pPr>
+        <w:pStyle w:val="ListParagraph"/>
+        <w:numPr>
+          <w:ilvl w:val="0"/>
+          <w:numId w:val="2"/>
+        </w:numPr>
+        <w:spacing w:after="90"/>
+      </w:pPr>
+      <w:r>
+        <w:rPr>
+          <w:b/>
+          <w:bCs/>
+          <w:color w:val="b91c1c"/>
+        </w:rPr>
+        <w:t xml:space="preserve">⊘  </w:t>
+      </w:r>
+      <w:r>
+        <w:rPr>
+          <w:strike/>
+          <w:color w:val="6b7280"/>
+        </w:rPr>
+        <w:t xml:space="preserve">Build academic-year promotion/rollover engine (bulk-advance school_class_id, mark graduated/transferred/withdrawn, preview-before-commit UI)</w:t>
+      </w:r>
+      <w:r>
+        <w:rPr>
+          <w:i/>
+          <w:iCs/>
+          <w:color w:val="b91c1c"/>
+        </w:rPr>
+        <w:t xml:space="preserve">  — descoped, not our purpose</w:t>
       </w:r>
     </w:p>
     <w:p>
@@ -855,35 +878,35 @@
         <w:spacing w:after="120" w:before="240"/>
       </w:pPr>
       <w:r>
-        <w:t xml:space="preserve">Medium (~4.5-6.5 pd)</w:t>
-      </w:r>
-    </w:p>
-    <w:p>
-      <w:pPr>
-        <w:pStyle w:val="ListParagraph"/>
-        <w:numPr>
-          <w:ilvl w:val="0"/>
-          <w:numId w:val="2"/>
-        </w:numPr>
-        <w:spacing w:after="90"/>
-      </w:pPr>
-      <w:r>
-        <w:rPr>
-          <w:b/>
-          <w:bCs/>
-        </w:rPr>
-        <w:t xml:space="preserve">☐  </w:t>
-      </w:r>
-      <w:r>
-        <w:t xml:space="preserve">Populate or gate the Transfer/TC log report (RPT-STU-015) — currently "runnable" but backed by an empty table.</w:t>
-      </w:r>
-      <w:r>
-        <w:rPr>
-          <w:i/>
-          <w:iCs/>
-          <w:color w:val="6b7280"/>
-        </w:rPr>
-        <w:t xml:space="preserve">  — effort: 0.5d (bundled with TC workflow)</w:t>
+        <w:t xml:space="preserve">Medium (~2.5 pd)</w:t>
+      </w:r>
+    </w:p>
+    <w:p>
+      <w:pPr>
+        <w:pStyle w:val="ListParagraph"/>
+        <w:numPr>
+          <w:ilvl w:val="0"/>
+          <w:numId w:val="2"/>
+        </w:numPr>
+        <w:spacing w:after="90"/>
+      </w:pPr>
+      <w:r>
+        <w:rPr>
+          <w:b/>
+          <w:bCs/>
+        </w:rPr>
+        <w:t xml:space="preserve">☐  </w:t>
+      </w:r>
+      <w:r>
+        <w:t xml:space="preserve">Hide/gate the Transfer/TC log report (RPT-STU-015) — TC workflow is descoped, so the report should be removed or hidden rather than left pointing at a permanently-empty table.</w:t>
+      </w:r>
+      <w:r>
+        <w:rPr>
+          <w:i/>
+          <w:iCs/>
+          <w:color w:val="6b7280"/>
+        </w:rPr>
+        <w:t xml:space="preserve">  — effort: 0.5d</w:t>
       </w:r>
     </w:p>
     <w:p>
@@ -955,19 +978,24 @@
         <w:rPr>
           <w:b/>
           <w:bCs/>
-        </w:rPr>
-        <w:t xml:space="preserve">☐  </w:t>
-      </w:r>
-      <w:r>
-        <w:t xml:space="preserve">Alumni ↔ Student linkage: nullable student_id FK on alumni, "Convert to alumni" action on graduation.</w:t>
-      </w:r>
-      <w:r>
-        <w:rPr>
-          <w:i/>
-          <w:iCs/>
-          <w:color w:val="6b7280"/>
-        </w:rPr>
-        <w:t xml:space="preserve">  — effort: 2-3d</w:t>
+          <w:color w:val="b91c1c"/>
+        </w:rPr>
+        <w:t xml:space="preserve">⊘  </w:t>
+      </w:r>
+      <w:r>
+        <w:rPr>
+          <w:strike/>
+          <w:color w:val="6b7280"/>
+        </w:rPr>
+        <w:t xml:space="preserve">Alumni ↔ Student linkage / "Convert to alumni" on graduation — depended on the now-descoped promotion engine</w:t>
+      </w:r>
+      <w:r>
+        <w:rPr>
+          <w:i/>
+          <w:iCs/>
+          <w:color w:val="b91c1c"/>
+        </w:rPr>
+        <w:t xml:space="preserve">  — descoped, not our purpose</w:t>
       </w:r>
     </w:p>
     <w:p>
@@ -3306,7 +3334,7 @@
         <w:spacing w:after="60"/>
       </w:pPr>
       <w:r>
-        <w:t xml:space="preserve">Student Registry — smallest remaining Critical block (~19-25 pd) and the most direct sibling of the Teacher Registry work just finished (TC workflow, reject-with-remarks, notifications largely mirror patterns already built for Teacher).</w:t>
+        <w:t xml:space="preserve">Student Registry — smallest remaining module (~17-21 pd total) now that TC workflow and the promotion engine are descoped; reject-with-remarks and the 4 notification triggers directly mirror patterns already built for Teacher.</w:t>
       </w:r>
     </w:p>
     <w:p>

</xml_diff>

<commit_message>
docs: descope Division/Section field from Student Registry plan
Client: "dont need section for students." Third Student Registry
scope exclusion this engagement (alongside TC workflow and the
promotion engine). Student Registry remaining effort revised from
~17-21 pd to ~14-18 pd. Task #78 removed from the in-app tracker,
kept as a struck-through/Descoped row in both docs for traceability.
</commit_message>
<xml_diff>
--- a/docs/GAP_ANALYSIS/Multi-Web_Completion_Plan_Status.docx
+++ b/docs/GAP_ANALYSIS/Multi-Web_Completion_Plan_Status.docx
@@ -332,7 +332,7 @@
                 <w:b w:val="false"/>
                 <w:bCs w:val="false"/>
               </w:rPr>
-              <w:t xml:space="preserve">~17-21 pd</w:t>
+              <w:t xml:space="preserve">~14-18 pd</w:t>
             </w:r>
           </w:p>
         </w:tc>
@@ -349,7 +349,7 @@
                 <w:b w:val="false"/>
                 <w:bCs w:val="false"/>
               </w:rPr>
-              <w:t xml:space="preserve">TC workflow and class-promotion engine descoped (not platform purpose). Reject-with-remarks + notifications are now the biggest items.</w:t>
+              <w:t xml:space="preserve">TC workflow, class-promotion engine, and Division/Section field all descoped (not platform purpose). Reject-with-remarks + notifications are now the biggest items.</w:t>
             </w:r>
           </w:p>
         </w:tc>
@@ -581,7 +581,7 @@
         <w:spacing w:after="120"/>
       </w:pPr>
       <w:r>
-        <w:t xml:space="preserve">Total remaining effort across the four not-fully-done modules: roughly 221-258 person-days. Sections below give the full checklist for each, carried over from the completion-plan re-audit (docs/GAP_ANALYSIS/COMPLETION_PLAN_Sports_Training_TalentSearch_Student_Teacher.docx), corrected against a direct re-check of the current codebase — the on-disk plan document's Talent Search section was stale (it still described 4 Critical items as unfixed that were in fact already implemented and committed in this engagement), so that section was verified fresh rather than copied as-is.</w:t>
+        <w:t xml:space="preserve">Total remaining effort across the four not-fully-done modules: roughly 218-255 person-days. Sections below give the full checklist for each, carried over from the completion-plan re-audit (docs/GAP_ANALYSIS/COMPLETION_PLAN_Sports_Training_TalentSearch_Student_Teacher.docx), corrected against a direct re-check of the current codebase — the on-disk plan document's Talent Search section was stale (it still described 4 Critical items as unfixed that were in fact already implemented and committed in this engagement), so that section was verified fresh rather than copied as-is.</w:t>
       </w:r>
     </w:p>
     <w:p>
@@ -594,7 +594,7 @@
           <w:bCs/>
           <w:color w:val="b91c1c"/>
         </w:rPr>
-        <w:t xml:space="preserve">Scope note: the TC/Transfer Certificate workflow and the academic-year student promotion/rollover engine were explicitly descoped by the client ("not our purpose") and are struck through below rather than estimated. Everything in Student Registry that depended on either has been reduced or removed accordingly.</w:t>
+        <w:t xml:space="preserve">Scope note: the TC/Transfer Certificate workflow, the academic-year student promotion/rollover engine, and the Division/Section field on Student were all explicitly descoped by the client ("not our purpose" / "dont need section for students") and are struck through below rather than estimated. Everything in Student Registry that depended on any of these has been reduced or removed accordingly.</w:t>
       </w:r>
     </w:p>
     <w:p>
@@ -645,7 +645,7 @@
         <w:spacing w:after="120"/>
       </w:pPr>
       <w:r>
-        <w:t xml:space="preserve">Baseline coverage 64%. Recent commits (2026-07-09/10) added fest class-group/cluster eligibility logic and a school-side import-history viewer — both genuine but neither closes a Student Registry gap. TC/Transfer Certificate workflow and academic-year class-promotion/rollover are explicitly out of scope (client decision — "not our purpose"); everything below reflects that. None of the remaining items have been started.</w:t>
+        <w:t xml:space="preserve">Baseline coverage 64%. Recent commits (2026-07-09/10) added fest class-group/cluster eligibility logic and a school-side import-history viewer — both genuine but neither closes a Student Registry gap. TC/Transfer Certificate workflow, academic-year class-promotion/rollover, and the Division/Section field are explicitly out of scope (client decision — "not our purpose" / "dont need section for students"); everything below reflects that. None of the remaining items have been started.</w:t>
       </w:r>
     </w:p>
     <w:p>
@@ -785,35 +785,40 @@
         <w:spacing w:after="120" w:before="240"/>
       </w:pPr>
       <w:r>
-        <w:t xml:space="preserve">High (~5-6 pd)</w:t>
-      </w:r>
-    </w:p>
-    <w:p>
-      <w:pPr>
-        <w:pStyle w:val="ListParagraph"/>
-        <w:numPr>
-          <w:ilvl w:val="0"/>
-          <w:numId w:val="2"/>
-        </w:numPr>
-        <w:spacing w:after="90"/>
-      </w:pPr>
-      <w:r>
-        <w:rPr>
-          <w:b/>
-          <w:bCs/>
-        </w:rPr>
-        <w:t xml:space="preserve">☐  </w:t>
-      </w:r>
-      <w:r>
-        <w:t xml:space="preserve">Restore Division/Section field on Student across model, importer, and Create/Edit/Import/List UI.</w:t>
-      </w:r>
-      <w:r>
-        <w:rPr>
-          <w:i/>
-          <w:iCs/>
-          <w:color w:val="6b7280"/>
-        </w:rPr>
-        <w:t xml:space="preserve">  — effort: 3d</w:t>
+        <w:t xml:space="preserve">High (~2-3 pd)</w:t>
+      </w:r>
+    </w:p>
+    <w:p>
+      <w:pPr>
+        <w:pStyle w:val="ListParagraph"/>
+        <w:numPr>
+          <w:ilvl w:val="0"/>
+          <w:numId w:val="2"/>
+        </w:numPr>
+        <w:spacing w:after="90"/>
+      </w:pPr>
+      <w:r>
+        <w:rPr>
+          <w:b/>
+          <w:bCs/>
+          <w:color w:val="b91c1c"/>
+        </w:rPr>
+        <w:t xml:space="preserve">⊘  </w:t>
+      </w:r>
+      <w:r>
+        <w:rPr>
+          <w:strike/>
+          <w:color w:val="6b7280"/>
+        </w:rPr>
+        <w:t xml:space="preserve">Restore Division/Section field on Student across model, importer, and Create/Edit/Import/List UI</w:t>
+      </w:r>
+      <w:r>
+        <w:rPr>
+          <w:i/>
+          <w:iCs/>
+          <w:color w:val="b91c1c"/>
+        </w:rPr>
+        <w:t xml:space="preserve">  — descoped, not our purpose</w:t>
       </w:r>
     </w:p>
     <w:p>
@@ -3334,7 +3339,7 @@
         <w:spacing w:after="60"/>
       </w:pPr>
       <w:r>
-        <w:t xml:space="preserve">Student Registry — smallest remaining module (~17-21 pd total) now that TC workflow and the promotion engine are descoped; reject-with-remarks and the 4 notification triggers directly mirror patterns already built for Teacher.</w:t>
+        <w:t xml:space="preserve">Student Registry — smallest remaining module (~14-18 pd total) now that TC workflow, the promotion engine, and the Division/Section field are all descoped; reject-with-remarks and the 4 notification triggers directly mirror patterns already built for Teacher.</w:t>
       </w:r>
     </w:p>
     <w:p>

</xml_diff>

<commit_message>
Update completion plan doc: all six modules fully done, 0 pd remaining
</commit_message>
<xml_diff>
--- a/docs/GAP_ANALYSIS/Multi-Web_Completion_Plan_Status.docx
+++ b/docs/GAP_ANALYSIS/Multi-Web_Completion_Plan_Status.docx
@@ -46,7 +46,7 @@
         <w:spacing w:after="120"/>
       </w:pPr>
       <w:r>
-        <w:t xml:space="preserve">Five of the six modules covered by the completion plan are now fully built: Sports Management, Teacher Registry, Student Registry, Teacher Training, and Talent Search (MCQ Exams). Academic Results/Toppers is nearly done — 24 of 30 checklist items implemented, with 6 small gaps remaining.</w:t>
+        <w:t xml:space="preserve">All six modules covered by the completion plan are now fully built: Sports Management, Teacher Registry, Student Registry, Teacher Training, Talent Search (MCQ Exams), and Academic Results/Toppers. Every tracked checklist item (157 total, 3 explicitly descoped) is implemented, verified, and committed.</w:t>
       </w:r>
     </w:p>
     <w:tbl>
@@ -528,7 +528,7 @@
                 <w:b w:val="false"/>
                 <w:bCs w:val="false"/>
               </w:rPr>
-              <w:t xml:space="preserve">Nearly done</w:t>
+              <w:t xml:space="preserve">Done</w:t>
             </w:r>
           </w:p>
         </w:tc>
@@ -545,7 +545,7 @@
                 <w:b w:val="false"/>
                 <w:bCs w:val="false"/>
               </w:rPr>
-              <w:t xml:space="preserve">~8-12 pd</w:t>
+              <w:t xml:space="preserve">0 pd</w:t>
             </w:r>
           </w:p>
         </w:tc>
@@ -562,7 +562,7 @@
                 <w:b w:val="false"/>
                 <w:bCs w:val="false"/>
               </w:rPr>
-              <w:t xml:space="preserve">24 of 30 checklist items implemented, verified, committed (incl. Ranking Engine, Awards Engine, API Index, verification workflow, public portal). 6 items partial/open: stream-master cleanup, subject-mark dual-write cleanup, 3 missing merit reports, audit-trail wiring.</w:t>
+              <w:t xml:space="preserve">All 30 checklist items implemented, verified, committed (incl. Ranking Engine, Awards Engine, API Index, verification workflow, public portal, audit trail, and the final stream/subject-mark cleanup + 3 remaining merit reports).</w:t>
             </w:r>
           </w:p>
         </w:tc>
@@ -581,7 +581,7 @@
         <w:spacing w:after="120"/>
       </w:pPr>
       <w:r>
-        <w:t xml:space="preserve">Total remaining effort: roughly 8-12 person-days, all in Academic Results/Toppers. This revision (2026-07-12) found a very large body of uncommitted work sitting in the working tree — 174 modified/new files spanning Teacher Training High/Medium/Low, all of Talent Search High/Medium/Low, and most of Academic Results/Toppers/Achievements. Each module's diff was verified item-by-item against the checklist by independent review before being committed (syntax-checked, cross-referenced against the specific FRD requirement, not just assumed done because a file changed).</w:t>
+        <w:t xml:space="preserve">Total remaining effort: 0 person-days. This revision (2026-07-12) found a very large body of uncommitted work sitting in the working tree across two passes — first 174 modified/new files spanning Teacher Training High/Medium/Low, all of Talent Search High/Medium/Low, and most of Academic Results/Toppers/Achievements, then a final batch of 12 files closing out Academic Results' last 6 items (stream/subject-mark cleanup, 3 missing merit reports, audit-trail wiring, DB validation constraints, dead column removal). Each module's diff was verified item-by-item against the checklist by independent review before being committed (syntax-checked, cross-referenced against the specific FRD requirement, not just assumed done because a file changed).</w:t>
       </w:r>
     </w:p>
     <w:p>
@@ -698,192 +698,20 @@
         <w:spacing w:after="150" w:before="300"/>
       </w:pPr>
       <w:r>
-        <w:t xml:space="preserve">Nearly done — CBSE Academic Results, Toppers &amp; Achievements (FRD-21)</w:t>
-      </w:r>
-    </w:p>
-    <w:p>
-      <w:pPr>
-        <w:spacing w:after="120"/>
-      </w:pPr>
-      <w:r>
-        <w:t xml:space="preserve">Previously a bare CMS content widget with zero workflow state and zero ranking logic — the largest remaining rebuild in the program. This revision found 24 of the 30 checklist items already implemented (uncommitted) in the working tree, independently verified against the actual code and committed: examination type + fixed uniqueness key, missing summary fields, Admission/Roll No on Topper, PDF upload + version history, a full Verification/Approval/Publish workflow (BoardResultVerificationController), public sections gated on published status, an automatic Ranking Engine (overall/stream/subject/pass-%/topper-count with tie-handling), a Sahodaya results dashboard, configurable Top-N toppers, an Academic Year FK with backfill command, an Academic Performance Index engine, a 7-category Awards Engine, a School Dashboard rank/topper widget, a Public Portal upgrade (rankings, year selector, search, merit-list PDFs), 6 FRD notifications, a Subject-wise Merit Register report, an Academic Excellence Report with historical comparison, a State-level consolidated dashboard, a correction/resubmission loop, Topper certificates, and Achievement-to-Award linkage.</w:t>
-      </w:r>
-    </w:p>
-    <w:p>
-      <w:pPr>
-        <w:pStyle w:val="Heading2"/>
-        <w:spacing w:after="120" w:before="240"/>
-      </w:pPr>
-      <w:r>
-        <w:t xml:space="preserve">Still open (~8-12 pd)</w:t>
-      </w:r>
-    </w:p>
-    <w:p>
-      <w:pPr>
-        <w:pStyle w:val="ListParagraph"/>
-        <w:numPr>
-          <w:ilvl w:val="0"/>
-          <w:numId w:val="2"/>
-        </w:numPr>
-        <w:spacing w:after="90"/>
-      </w:pPr>
-      <w:r>
-        <w:rPr>
-          <w:b/>
-          <w:bCs/>
-        </w:rPr>
-        <w:t xml:space="preserve">☐  </w:t>
-      </w:r>
-      <w:r>
-        <w:t xml:space="preserve">Real Stream master cleanup: exam_streams table + stream_id FK exist, but BoardExamSubjects.php still retains the old hardcoded list as a fallback — not fully cut over.</w:t>
-      </w:r>
+        <w:t xml:space="preserve">Done — CBSE Academic Results, Toppers &amp; Achievements (FRD-21)</w:t>
+      </w:r>
+    </w:p>
+    <w:p>
+      <w:pPr>
+        <w:spacing w:after="120"/>
+      </w:pPr>
       <w:r>
         <w:rPr>
           <w:i/>
           <w:iCs/>
-          <w:color w:val="6b7280"/>
+          <w:color w:val="15803d"/>
         </w:rPr>
-        <w:t xml:space="preserve">  — effort: 1d</w:t>
-      </w:r>
-    </w:p>
-    <w:p>
-      <w:pPr>
-        <w:pStyle w:val="ListParagraph"/>
-        <w:numPr>
-          <w:ilvl w:val="0"/>
-          <w:numId w:val="2"/>
-        </w:numPr>
-        <w:spacing w:after="90"/>
-      </w:pPr>
-      <w:r>
-        <w:rPr>
-          <w:b/>
-          <w:bCs/>
-        </w:rPr>
-        <w:t xml:space="preserve">☐  </w:t>
-      </w:r>
-      <w:r>
-        <w:t xml:space="preserve">Subject-wise topper normalization cleanup: topper_subject_marks table exists, but the old subject_marks JSON column on Topper was never dropped — currently dual-write.</w:t>
-      </w:r>
-      <w:r>
-        <w:rPr>
-          <w:i/>
-          <w:iCs/>
-          <w:color w:val="6b7280"/>
-        </w:rPr>
-        <w:t xml:space="preserve">  — effort: 1-2d</w:t>
-      </w:r>
-    </w:p>
-    <w:p>
-      <w:pPr>
-        <w:pStyle w:val="ListParagraph"/>
-        <w:numPr>
-          <w:ilvl w:val="0"/>
-          <w:numId w:val="2"/>
-        </w:numPr>
-        <w:spacing w:after="90"/>
-      </w:pPr>
-      <w:r>
-        <w:rPr>
-          <w:b/>
-          <w:bCs/>
-        </w:rPr>
-        <w:t xml:space="preserve">☐  </w:t>
-      </w:r>
-      <w:r>
-        <w:t xml:space="preserve">Merit Register + 5 core reports: only 2 of 5 named reports exist (Subject Merit Register, Excellence Report). School Result Summary, Overall Ranking, Pass % Report, and Class X + Stream Merit Registers are still missing.</w:t>
-      </w:r>
-      <w:r>
-        <w:rPr>
-          <w:i/>
-          <w:iCs/>
-          <w:color w:val="6b7280"/>
-        </w:rPr>
-        <w:t xml:space="preserve">  — effort: 4d</w:t>
-      </w:r>
-    </w:p>
-    <w:p>
-      <w:pPr>
-        <w:pStyle w:val="ListParagraph"/>
-        <w:numPr>
-          <w:ilvl w:val="0"/>
-          <w:numId w:val="2"/>
-        </w:numPr>
-        <w:spacing w:after="90"/>
-      </w:pPr>
-      <w:r>
-        <w:rPr>
-          <w:b/>
-          <w:bCs/>
-        </w:rPr>
-        <w:t xml:space="preserve">☐  </w:t>
-      </w:r>
-      <w:r>
-        <w:t xml:space="preserve">Audit trail wiring: no DataChangeLogger calls found on BoardResult/Topper/Achievement mutations, no Audit History tab.</w:t>
-      </w:r>
-      <w:r>
-        <w:rPr>
-          <w:i/>
-          <w:iCs/>
-          <w:color w:val="6b7280"/>
-        </w:rPr>
-        <w:t xml:space="preserve">  — effort: 3d</w:t>
-      </w:r>
-    </w:p>
-    <w:p>
-      <w:pPr>
-        <w:pStyle w:val="ListParagraph"/>
-        <w:numPr>
-          <w:ilvl w:val="0"/>
-          <w:numId w:val="2"/>
-        </w:numPr>
-        <w:spacing w:after="90"/>
-      </w:pPr>
-      <w:r>
-        <w:rPr>
-          <w:b/>
-          <w:bCs/>
-        </w:rPr>
-        <w:t xml:space="preserve">☐  </w:t>
-      </w:r>
-      <w:r>
-        <w:t xml:space="preserve">Validation hardening: app-level pass_count &lt;= total_appeared and dup-rank checks exist, but no DB-level constraint enforces it.</w:t>
-      </w:r>
-      <w:r>
-        <w:rPr>
-          <w:i/>
-          <w:iCs/>
-          <w:color w:val="6b7280"/>
-        </w:rPr>
-        <w:t xml:space="preserve">  — effort: 0.5d</w:t>
-      </w:r>
-    </w:p>
-    <w:p>
-      <w:pPr>
-        <w:pStyle w:val="ListParagraph"/>
-        <w:numPr>
-          <w:ilvl w:val="0"/>
-          <w:numId w:val="2"/>
-        </w:numPr>
-        <w:spacing w:after="90"/>
-      </w:pPr>
-      <w:r>
-        <w:rPr>
-          <w:b/>
-          <w:bCs/>
-        </w:rPr>
-        <w:t xml:space="preserve">☐  </w:t>
-      </w:r>
-      <w:r>
-        <w:t xml:space="preserve">Remove the dead subject_stats column, or wire it into the subject normalization work above.</w:t>
-      </w:r>
-      <w:r>
-        <w:rPr>
-          <w:i/>
-          <w:iCs/>
-          <w:color w:val="6b7280"/>
-        </w:rPr>
-        <w:t xml:space="preserve">  — effort: 0.5d</w:t>
+        <w:t xml:space="preserve">Previously a bare CMS content widget with zero workflow state and zero ranking logic — the largest rebuild in the program. All 30 checklist items are now implemented, verified against the actual code, and committed across two passes: examination type + fixed uniqueness key, missing summary fields, Admission/Roll No on Topper, PDF upload + version history, a full Verification/Approval/Publish workflow (BoardResultVerificationController), public sections gated on published status, an automatic Ranking Engine (overall/stream/subject/pass-%/topper-count with tie-handling), a Sahodaya results dashboard, configurable Top-N toppers, an Academic Year FK with backfill command, an Academic Performance Index engine, a 7-category Awards Engine, a School Dashboard rank/topper widget, a Public Portal upgrade (rankings, year selector, search, merit-list PDFs), 6 FRD notifications, a full Merit Register (5 core reports: School Result Summary, Overall Ranking, Pass % Report, Class X + Stream Merit Registers, plus Subject-wise Merit Register and Academic Excellence Report), a State-level consolidated dashboard, a correction/resubmission loop, Topper certificates, Achievement-to-Award linkage, DataChangeLogger audit trail wiring across all BoardResult/Topper/Achievement mutations, DB-level validation constraints (pass_count &lt;= total_appeared, unique rank per result), the exam_streams cutover (hardcoded BoardExamSubjects fallback removed), and the subject_marks JSON-to-topper_subject_marks migration with the dead column dropped.</w:t>
       </w:r>
     </w:p>
     <w:p>
@@ -900,7 +728,7 @@
         <w:spacing w:after="120"/>
       </w:pPr>
       <w:r>
-        <w:t xml:space="preserve">Sports Management, Teacher Registry, Student Registry, Teacher Training, and Talent Search/MCQ are all fully done and need no further action. Only Academic Results/Toppers has open items, and they're independent small cleanups rather than a coordinated build — any can be picked up in any order.</w:t>
+        <w:t xml:space="preserve">All six modules are fully done and committed. No further action is pending anywhere in this completion plan.</w:t>
       </w:r>
     </w:p>
     <w:p>
@@ -913,20 +741,7 @@
         <w:spacing w:after="60"/>
       </w:pPr>
       <w:r>
-        <w:t xml:space="preserve">Student Registry, Teacher Training, Talent Search — fully done, nothing further pending.</w:t>
-      </w:r>
-    </w:p>
-    <w:p>
-      <w:pPr>
-        <w:pStyle w:val="ListParagraph"/>
-        <w:numPr>
-          <w:ilvl w:val="0"/>
-          <w:numId w:val="2"/>
-        </w:numPr>
-        <w:spacing w:after="60"/>
-      </w:pPr>
-      <w:r>
-        <w:t xml:space="preserve">Academic Results/Toppers — 24 of 30 items done; the audit-trail wiring (3d) and the 3 missing merit reports (4d) are the two largest remaining pieces, the rest are quick cleanups (~0.5-2d each).</w:t>
+        <w:t xml:space="preserve">Sports Management, Teacher Registry, Student Registry, Teacher Training, Talent Search/MCQ, Academic Results/Toppers — all fully done, nothing further pending.</w:t>
       </w:r>
     </w:p>
     <w:sectPr>

</xml_diff>